<commit_message>
Fix baseline-change figures and align normalized point scales
</commit_message>
<xml_diff>
--- a/docs/BioEntropy_V1.0_SI_CN.docx
+++ b/docs/BioEntropy_V1.0_SI_CN.docx
@@ -1740,7 +1740,211 @@
     </w:p>
     <w:p>
       <w:r>
-        <w:t>原始组水平距离图显示 D 的均值，状态分数图显示公式 S6。个体状态分数散点可对正距离使用 ln(D)+½ln(2πe)，其算术平均值一般不等于公式 S6；零距离不显示在该对数散点层。可选归一化图在正常组及模型组均可用时，以两者均值分别锚定 0 和 100，否则采用实验内最小最大值缩放；全部数值相同则映射为 50。线性指数 L 被限制于 [0,100]，对比度增强采用 100(L/100)³。这些显示变换及单独缩放的个体散点不是效应量，定量解释应依据原始估计值及其区间。</w:t>
+        <w:br w:type="page"/>
+      </w:r>
+    </w:p>
+    <w:p>
+      <w:pPr>
+        <w:pStyle w:val="Heading1"/>
+      </w:pPr>
+      <w:r>
+        <w:t>图形汇总与基线变化</w:t>
+      </w:r>
+    </w:p>
+    <w:p>
+      <w:r>
+        <w:t>软件保留原始组水平估计值及其既有区间。距离图显示 D 的均值；Entropy 图显示所选组水平分数，并通过方法字段区分 Hstate 与 Hcov。Entropy 图及组合图的 Entropy 部分不叠加 ln(D)+½ln(2πe) 个体散点：这些散点的均值一般不等于 Hstate，也不代表 Hcov 的个体贡献。个体 NMD、BRI 和 NRBS 原值仍保留在数据输出中。</w:t>
+      </w:r>
+    </w:p>
+    <w:p>
+      <w:r>
+        <w:t>每幅归一化图内，每个指标根据该实验的有效组汇总行拟合一套锚点。正常组和模型组均值可用且不同时，分别定义 0 和 100；否则使用汇总值的最小值和最大值。组合图先要求两项绘图指标均有效，因此其锚点所用行可能与单指标图不同。线性指数 L 限制于 [0,100]；汇总值恒定时 L=50。常规归一化图使用 100(L/100)³，单时间点状态图（Fig08）使用线性 L。绘制个体散点时，NMD、BRI 或 NRBS 的散点和组估计值共享锚点、边界截断和显示变换；散点不再按自身范围拟合。多时间点组合图（Fig05）无个体散点，其单时间点版本可显示负担散点。变换后的组估计值通常不等于变换后散点的均值。线性值保留在导出数据中。</w:t>
+      </w:r>
+    </w:p>
+    <w:p>
+      <w:pPr>
+        <w:keepNext/>
+      </w:pPr>
+      <w:r>
+        <w:t>纵向输出另提供所选负担指标（NMD、NRBS 或 BRI）及 Entropy 的基线变化曲线。以 Xg,t 表示组别 g 在时间点 t 的原始组水平估计值，以 bg 表示该组采用的基线时间点。图中变化值为</w:t>
+      </w:r>
+    </w:p>
+    <w:p>
+      <w:pPr>
+        <w:keepLines/>
+        <w:spacing w:before="60" w:after="120"/>
+        <w:jc w:val="center"/>
+      </w:pPr>
+      <m:oMathPara>
+        <m:oMathParaPr>
+          <m:jc m:val="center"/>
+        </m:oMathParaPr>
+        <m:oMath>
+          <m:sSub>
+            <m:e>
+              <m:r>
+                <m:rPr>
+                  <m:sty m:val="p"/>
+                </m:rPr>
+                <w:rPr>
+                  <w:rFonts w:ascii="Cambria Math" w:hAnsi="Cambria Math"/>
+                  <w:sz w:val="22"/>
+                </w:rPr>
+                <m:t>ΔX</m:t>
+              </m:r>
+            </m:e>
+            <m:sub>
+              <m:r>
+                <m:rPr>
+                  <m:sty m:val="p"/>
+                </m:rPr>
+                <w:rPr>
+                  <w:rFonts w:ascii="Cambria Math" w:hAnsi="Cambria Math"/>
+                  <w:sz w:val="22"/>
+                </w:rPr>
+                <m:t>g,t</m:t>
+              </m:r>
+            </m:sub>
+          </m:sSub>
+          <m:r>
+            <m:rPr>
+              <m:sty m:val="p"/>
+            </m:rPr>
+            <w:rPr>
+              <w:rFonts w:ascii="Cambria Math" w:hAnsi="Cambria Math"/>
+              <w:sz w:val="22"/>
+            </w:rPr>
+            <m:t> = </m:t>
+          </m:r>
+          <m:sSub>
+            <m:e>
+              <m:r>
+                <m:rPr>
+                  <m:sty m:val="p"/>
+                </m:rPr>
+                <w:rPr>
+                  <w:rFonts w:ascii="Cambria Math" w:hAnsi="Cambria Math"/>
+                  <w:sz w:val="22"/>
+                </w:rPr>
+                <m:t>X</m:t>
+              </m:r>
+            </m:e>
+            <m:sub>
+              <m:r>
+                <m:rPr>
+                  <m:sty m:val="p"/>
+                </m:rPr>
+                <w:rPr>
+                  <w:rFonts w:ascii="Cambria Math" w:hAnsi="Cambria Math"/>
+                  <w:sz w:val="22"/>
+                </w:rPr>
+                <m:t>g,t</m:t>
+              </m:r>
+            </m:sub>
+          </m:sSub>
+          <m:r>
+            <m:rPr>
+              <m:sty m:val="p"/>
+            </m:rPr>
+            <w:rPr>
+              <w:rFonts w:ascii="Cambria Math" w:hAnsi="Cambria Math"/>
+              <w:sz w:val="22"/>
+            </w:rPr>
+            <m:t> − </m:t>
+          </m:r>
+          <m:sSub>
+            <m:e>
+              <m:r>
+                <m:rPr>
+                  <m:sty m:val="p"/>
+                </m:rPr>
+                <w:rPr>
+                  <w:rFonts w:ascii="Cambria Math" w:hAnsi="Cambria Math"/>
+                  <w:sz w:val="22"/>
+                </w:rPr>
+                <m:t>X</m:t>
+              </m:r>
+            </m:e>
+            <m:sub>
+              <m:r>
+                <m:rPr>
+                  <m:sty m:val="p"/>
+                </m:rPr>
+                <w:rPr>
+                  <w:rFonts w:ascii="Cambria Math" w:hAnsi="Cambria Math"/>
+                  <w:sz w:val="22"/>
+                </w:rPr>
+                <m:t>g,bg</m:t>
+              </m:r>
+            </m:sub>
+          </m:sSub>
+          <m:r>
+            <m:rPr>
+              <m:sty m:val="p"/>
+            </m:rPr>
+            <w:rPr>
+              <w:rFonts w:ascii="Cambria Math" w:hAnsi="Cambria Math"/>
+              <w:sz w:val="22"/>
+            </w:rPr>
+            <m:t>,    </m:t>
+          </m:r>
+          <m:sSub>
+            <m:e>
+              <m:r>
+                <m:rPr>
+                  <m:sty m:val="p"/>
+                </m:rPr>
+                <w:rPr>
+                  <w:rFonts w:ascii="Cambria Math" w:hAnsi="Cambria Math"/>
+                  <w:sz w:val="22"/>
+                </w:rPr>
+                <m:t>ΔX</m:t>
+              </m:r>
+            </m:e>
+            <m:sub>
+              <m:r>
+                <m:rPr>
+                  <m:sty m:val="p"/>
+                </m:rPr>
+                <w:rPr>
+                  <w:rFonts w:ascii="Cambria Math" w:hAnsi="Cambria Math"/>
+                  <w:sz w:val="22"/>
+                </w:rPr>
+                <m:t>g,bg</m:t>
+              </m:r>
+            </m:sub>
+          </m:sSub>
+          <m:r>
+            <m:rPr>
+              <m:sty m:val="p"/>
+            </m:rPr>
+            <w:rPr>
+              <w:rFonts w:ascii="Cambria Math" w:hAnsi="Cambria Math"/>
+              <w:sz w:val="22"/>
+            </w:rPr>
+            <m:t> = 0</m:t>
+          </m:r>
+          <m:r>
+            <m:rPr>
+              <m:sty m:val="p"/>
+            </m:rPr>
+            <w:rPr>
+              <w:rFonts w:ascii="Cambria Math" w:hAnsi="Cambria Math"/>
+              <w:sz w:val="22"/>
+            </w:rPr>
+            <m:t>    (S8)</m:t>
+          </m:r>
+        </m:oMath>
+      </m:oMathPara>
+    </w:p>
+    <w:p>
+      <w:r>
+        <w:t>优先采用有效的 0W 组估计值；若不可用，则使用该组最早具有有限估计值的时间点，并在图形数据中记录实际基线周数及其数值。因此，具有有效 0W 值的各组起点均为零。非 0W 的回退基线会被明确标注，不能称为 0W。某组至少有两个有效时间点才绘制变化曲线。单时间点动物数据不会仅因内部标签为 0W 而生成基线变化图。变化曲线使用原始值之差，不进行 0–100 归一化或三次方变换；原始水平图及归一化水平图同时保留。</w:t>
+      </w:r>
+    </w:p>
+    <w:p>
+      <w:r>
+        <w:t>基线变化图仅显示组曲线，不叠加个体散点或变化值区间；直接平移原始区间无法考虑基线估计的不确定性。基线相减不改变原始估计值、区间、组间比较或效应量，不构成个体配对变化分析或基线校正的协方差分析（ANCOVA）。应核对各时间点的样本量及样本组成，因为组成变化也会影响组水平轨迹。解释纵向熵变化前还应确认 Entropy 方法字段一致。变化图中的零表示相对于所选基线无变化，不代表正常生理状态或熵为零。</w:t>
       </w:r>
     </w:p>
     <w:p>
@@ -1959,7 +2163,7 @@
               <w:rFonts w:ascii="Cambria Math" w:hAnsi="Cambria Math"/>
               <w:sz w:val="22"/>
             </w:rPr>
-            <m:t>    (S8)</m:t>
+            <m:t>    (S9)</m:t>
           </m:r>
         </m:oMath>
       </m:oMathPara>
@@ -2166,14 +2370,14 @@
               <w:rFonts w:ascii="Cambria Math" w:hAnsi="Cambria Math"/>
               <w:sz w:val="22"/>
             </w:rPr>
-            <m:t>    (S9)</m:t>
+            <m:t>    (S10)</m:t>
           </m:r>
         </m:oMath>
       </m:oMathPara>
     </w:p>
     <w:p>
       <w:r>
-        <w:t>Hedges’ g 使用 E 计算，不使用组协方差熵；加法常数在 g 中抵消。模块另行导出描述性的组协方差熵，但这些值不进入该合并熵效应。公式 S9 的个体均值不等于公式 S6。线性距离和对数距离效应描述相关信息，不能当作两项独立证据相互验证。</w:t>
+        <w:t>Hedges’ g 使用 E 计算，不使用组协方差熵；加法常数在 g 中抵消。模块另行导出描述性的组协方差熵，但这些值不进入该合并熵效应。公式 S10 的个体均值不等于公式 S6。线性距离和对数距离效应描述相关信息，不能当作两项独立证据相互验证。</w:t>
       </w:r>
     </w:p>
     <w:p>
@@ -2565,7 +2769,7 @@
               <w:rFonts w:ascii="Cambria Math" w:hAnsi="Cambria Math"/>
               <w:sz w:val="22"/>
             </w:rPr>
-            <m:t>    (S10)</m:t>
+            <m:t>    (S11)</m:t>
           </m:r>
         </m:oMath>
       </m:oMathPara>
@@ -2913,7 +3117,7 @@
               <w:rFonts w:ascii="Cambria Math" w:hAnsi="Cambria Math"/>
               <w:sz w:val="22"/>
             </w:rPr>
-            <m:t>    (S11)</m:t>
+            <m:t>    (S12)</m:t>
           </m:r>
         </m:oMath>
       </m:oMathPara>
@@ -3265,7 +3469,7 @@
               <w:rFonts w:ascii="Cambria Math" w:hAnsi="Cambria Math"/>
               <w:sz w:val="22"/>
             </w:rPr>
-            <m:t>    (S12)</m:t>
+            <m:t>    (S13)</m:t>
           </m:r>
         </m:oMath>
       </m:oMathPara>

</xml_diff>

<commit_message>
Align longitudinal display baselines at nonzero index
</commit_message>
<xml_diff>
--- a/docs/BioEntropy_V1.0_SI_CN.docx
+++ b/docs/BioEntropy_V1.0_SI_CN.docx
@@ -1748,7 +1748,7 @@
         <w:pStyle w:val="Heading1"/>
       </w:pPr>
       <w:r>
-        <w:t>图形汇总与基线变化</w:t>
+        <w:t>图形汇总与基线对齐</w:t>
       </w:r>
     </w:p>
     <w:p>
@@ -1758,7 +1758,7 @@
     </w:p>
     <w:p>
       <w:r>
-        <w:t>每幅归一化图内，每个指标根据该实验的有效组汇总行拟合一套锚点。正常组和模型组均值可用且不同时，分别定义 0 和 100；否则使用汇总值的最小值和最大值。组合图先要求两项绘图指标均有效，因此其锚点所用行可能与单指标图不同。线性指数 L 限制于 [0,100]；汇总值恒定时 L=50。常规归一化图使用 100(L/100)³，单时间点状态图（Fig08）使用线性 L。绘制个体散点时，NMD、BRI 或 NRBS 的散点和组估计值共享锚点、边界截断和显示变换；散点不再按自身范围拟合。多时间点组合图（Fig05）无个体散点，其单时间点版本可显示负担散点。变换后的组估计值通常不等于变换后散点的均值。线性值保留在导出数据中。</w:t>
+        <w:t>对于归一化水平图，每个指标根据该实验的有效组汇总行拟合一套锚点。正常组和模型组均值可用且不同时，分别定义 0 和 100；否则使用汇总值的最小值和最大值。组合图先要求两项绘图指标均有效，因此其锚点所用行可能与单指标图不同。线性指数 L 限制于 [0,100]；汇总值恒定时 L=50。常规归一化图使用 100(L/100)³，单时间点状态图（Fig08）使用线性 L。绘制个体散点时，NMD、BRI 或 NRBS 的散点和组估计值共享锚点、边界截断和显示变换；散点不再按自身范围拟合。多时间点组合图（Fig05）无个体散点，其单时间点版本可显示负担散点。变换后的组估计值通常不等于变换后散点的均值。线性值保留在导出数据中。</w:t>
       </w:r>
     </w:p>
     <w:p>
@@ -1766,7 +1766,7 @@
         <w:keepNext/>
       </w:pPr>
       <w:r>
-        <w:t>纵向输出另提供所选负担指标（NMD、NRBS 或 BRI）及 Entropy 的基线变化曲线。以 Xg,t 表示组别 g 在时间点 t 的原始组水平估计值，以 bg 表示该组采用的基线时间点。图中变化值为</w:t>
+        <w:t>纵向主图09/10提供所选负担指标（NMD、NRBS或BRI）及Entropy的基线对齐归一化展示。令Xg,t为组g在时间t的原始组估计，bg为该组基线时间，B为符合条件各组基线的算术平均。对齐后的值为</w:t>
       </w:r>
     </w:p>
     <w:p>
@@ -1790,7 +1790,7 @@
                   <w:rFonts w:ascii="Cambria Math" w:hAnsi="Cambria Math"/>
                   <w:sz w:val="22"/>
                 </w:rPr>
-                <m:t>ΔX</m:t>
+                <m:t>A</m:t>
               </m:r>
             </m:e>
             <m:sub>
@@ -1886,43 +1886,7 @@
               <w:rFonts w:ascii="Cambria Math" w:hAnsi="Cambria Math"/>
               <w:sz w:val="22"/>
             </w:rPr>
-            <m:t>,    </m:t>
-          </m:r>
-          <m:sSub>
-            <m:e>
-              <m:r>
-                <m:rPr>
-                  <m:sty m:val="p"/>
-                </m:rPr>
-                <w:rPr>
-                  <w:rFonts w:ascii="Cambria Math" w:hAnsi="Cambria Math"/>
-                  <w:sz w:val="22"/>
-                </w:rPr>
-                <m:t>ΔX</m:t>
-              </m:r>
-            </m:e>
-            <m:sub>
-              <m:r>
-                <m:rPr>
-                  <m:sty m:val="p"/>
-                </m:rPr>
-                <w:rPr>
-                  <w:rFonts w:ascii="Cambria Math" w:hAnsi="Cambria Math"/>
-                  <w:sz w:val="22"/>
-                </w:rPr>
-                <m:t>g,bg</m:t>
-              </m:r>
-            </m:sub>
-          </m:sSub>
-          <m:r>
-            <m:rPr>
-              <m:sty m:val="p"/>
-            </m:rPr>
-            <w:rPr>
-              <w:rFonts w:ascii="Cambria Math" w:hAnsi="Cambria Math"/>
-              <w:sz w:val="22"/>
-            </w:rPr>
-            <m:t> = 0</m:t>
+            <m:t> + B</m:t>
           </m:r>
           <m:r>
             <m:rPr>
@@ -1939,12 +1903,12 @@
     </w:p>
     <w:p>
       <w:r>
-        <w:t>优先采用有效的 0W 组估计值；若不可用，则使用该组最早具有有限估计值的时间点，并在图形数据中记录实际基线周数及其数值。因此，具有有效 0W 值的各组起点均为零。非 0W 的回退基线会被明确标注，不能称为 0W。某组至少有两个有效时间点才绘制变化曲线。单时间点动物数据不会仅因内部标签为 0W 而生成基线变化图。变化曲线使用原始值之差，不进行 0–100 归一化或三次方变换；原始水平图及归一化水平图同时保留。</w:t>
+        <w:t>优先使用有效0W估计；缺失时标明并记录最早有效时间点。每组至少需要两个有效时间点。每个实验和指标按对齐后的组值拟合共同最小、最大锚点，映射并截断至0–100，再采用同一gamma=3展示变换。缩放前各组基线均为B，因此展示起点重叠。只有下降或不变轨迹时起点为100；非恒定且无下降时，下锚点向下扩展一个观测跨度，使基线非零；恒定范围采用线性50。导出数据保留原值、原始差值及全部缩放锚点。</w:t>
       </w:r>
     </w:p>
     <w:p>
       <w:r>
-        <w:t>基线变化图仅显示组曲线，不叠加个体散点或变化值区间；直接平移原始区间无法考虑基线估计的不确定性。基线相减不改变原始估计值、区间、组间比较或效应量，不构成个体配对变化分析或基线校正的协方差分析（ANCOVA）。应核对各时间点的样本量及样本组成，因为组成变化也会影响组水平轨迹。解释纵向熵变化前还应确认 Entropy 方法字段一致。变化图中的零表示相对于所选基线无变化，不代表正常生理状态或熵为零。</w:t>
+        <w:t>负担散点使用所属组的基线偏移，以及折线同一套锚点、截断和gamma；它们不是个体配对变化。Entropy不叠加个体点。这些图不新增变化值区间或显著性检验。展示值不是原始指标或下降百分比，0不表示原始距离或熵为0。基线对齐不改变原始估计、区间、组间比较或效应量，也不构成基线校正的ANCOVA。解释轨迹时应核对各时间点样本组成及Entropy方法一致性。单时间点数据保留组间展示。</w:t>
       </w:r>
     </w:p>
     <w:p>

</xml_diff>

<commit_message>
Consolidate longitudinal baseline displays into figures 02 and 04
</commit_message>
<xml_diff>
--- a/docs/BioEntropy_V1.0_SI_CN.docx
+++ b/docs/BioEntropy_V1.0_SI_CN.docx
@@ -1758,7 +1758,7 @@
     </w:p>
     <w:p>
       <w:r>
-        <w:t>对于归一化水平图，每个指标根据该实验的有效组汇总行拟合一套锚点。正常组和模型组均值可用且不同时，分别定义 0 和 100；否则使用汇总值的最小值和最大值。组合图先要求两项绘图指标均有效，因此其锚点所用行可能与单指标图不同。线性指数 L 限制于 [0,100]；汇总值恒定时 L=50。常规归一化图使用 100(L/100)³，单时间点状态图（Fig08）使用线性 L。绘制个体散点时，NMD、BRI 或 NRBS 的散点和组估计值共享锚点、边界截断和显示变换；散点不再按自身范围拟合。多时间点组合图（Fig05）无个体散点，其单时间点版本可显示负担散点。变换后的组估计值通常不等于变换后散点的均值。线性值保留在导出数据中。</w:t>
+        <w:t>对于归一化水平图（包括单时间点主图02/04与组合展示），每个指标根据该实验的有效组汇总行拟合一套锚点。正常组和模型组均值可用且不同时，分别定义 0 和 100；否则使用汇总值的最小值和最大值。组合图先要求两项绘图指标均有效，因此其锚点所用行可能与单指标图不同。线性指数 L 限制于 [0,100]；汇总值恒定时 L=50。常规归一化图使用 100(L/100)³，单时间点状态图（Fig08）使用线性 L。绘制个体散点时，NMD、BRI 或 NRBS 的散点和组估计值共享锚点、边界截断和显示变换；散点不再按自身范围拟合。多时间点组合图（Fig05）无个体散点，其单时间点版本可显示负担散点。变换后的组估计值通常不等于变换后散点的均值。线性值保留在导出数据中。</w:t>
       </w:r>
     </w:p>
     <w:p>
@@ -1766,7 +1766,7 @@
         <w:keepNext/>
       </w:pPr>
       <w:r>
-        <w:t>纵向主图09/10提供所选负担指标（NMD、NRBS或BRI）及Entropy的基线对齐归一化展示。令Xg,t为组g在时间t的原始组估计，bg为该组基线时间，B为符合条件各组基线的算术平均。对齐后的值为</w:t>
+        <w:t>多时间点实验输出8个主图文件，其中主图02/04提供所选负担指标（NMD、NRBS或BRI）及Entropy的基线对齐归一化展示。令Xg,t为组g在时间t的原始组估计，bg为该组基线时间，B为符合条件各组基线的算术平均。对齐后的值为</w:t>
       </w:r>
     </w:p>
     <w:p>
@@ -1908,7 +1908,7 @@
     </w:p>
     <w:p>
       <w:r>
-        <w:t>负担散点使用所属组的基线偏移，以及折线同一套锚点、截断和gamma；它们不是个体配对变化。Entropy不叠加个体点。这些图不新增变化值区间或显著性检验。展示值不是原始指标或下降百分比，0不表示原始距离或熵为0。基线对齐不改变原始估计、区间、组间比较或效应量，也不构成基线校正的ANCOVA。解释轨迹时应核对各时间点样本组成及Entropy方法一致性。单时间点数据保留组间展示。</w:t>
+        <w:t>负担散点使用所属组的基线偏移，以及折线同一套锚点、截断和gamma；它们不是个体配对变化。Entropy不叠加个体点。这些图不新增变化值区间或显著性检验。展示值不是原始指标或下降百分比，0不表示原始距离或熵为0。基线对齐不改变原始估计、区间、组间比较或效应量，也不构成基线校正的ANCOVA。解释轨迹时应核对各时间点样本组成及Entropy方法一致性。原始组值保留在主图01/03及结果表中。单时间点实验保留9个主图文件和原有的归一化水平图02/04，不进行纵向基线对齐。</w:t>
       </w:r>
     </w:p>
     <w:p>

</xml_diff>